<commit_message>
feat: complete HW8 — 30 agents on 2 VPSes with financial reporting
- 30/30 agents registered (was 28, funded remaining 2)
- Split across 2 Hetzner VPSes: Nuremberg (15) + Helsinki (15)
- Each agent has OpenClaw workspace with SOUL.md + ERC-8004 skill
- Cross-region transactions verified (Helsinki -> Nuremberg)
- 184 transactions synced via Blockscout
- Updated video and DOCX with correct numbers

VPS 1: 91.99.168.236 (Nuremberg) — agents 01-15
VPS 2: 62.238.6.94 (Helsinki) — agents 16-30

Co-Authored-By: Claude Opus 4.6 (1M context) <noreply@anthropic.com>
</commit_message>
<xml_diff>
--- a/experiments/HW8-EXPERIMENT-SUMMARY.docx
+++ b/experiments/HW8-EXPERIMENT-SUMMARY.docx
@@ -300,7 +300,7 @@
                 <w:sz w:val="17"/>
                 <w:szCs w:val="17"/>
               </w:rPr>
-              <w:t xml:space="preserve">30 OpenClaw agents on Hetzner VPS</w:t>
+              <w:t xml:space="preserve">30 OpenClaw agents on 2 Hetzner VPSes</w:t>
             </w:r>
           </w:p>
         </w:tc>
@@ -385,7 +385,7 @@
                 <w:sz w:val="17"/>
                 <w:szCs w:val="17"/>
               </w:rPr>
-              <w:t xml:space="preserve">Hetzner VPS (Nuremberg) + Vercel + Neon Postgres</w:t>
+              <w:t xml:space="preserve">2 VPSes (Nuremberg + Helsinki) + Vercel + Neon Postgres</w:t>
             </w:r>
           </w:p>
         </w:tc>
@@ -470,7 +470,7 @@
                 <w:sz w:val="17"/>
                 <w:szCs w:val="17"/>
               </w:rPr>
-              <w:t xml:space="preserve">OpenClaw with SOUL.md + ERC-8004 skill</w:t>
+              <w:t xml:space="preserve">OpenClaw with SOUL.md + ERC-8004 skill + Gemini LLM</w:t>
             </w:r>
           </w:p>
         </w:tc>
@@ -555,7 +555,7 @@
                 <w:sz w:val="17"/>
                 <w:szCs w:val="17"/>
               </w:rPr>
-              <w:t xml:space="preserve">Auto income statements from classified txs</w:t>
+              <w:t xml:space="preserve">Auto income statements from on-chain transactions</w:t>
             </w:r>
           </w:p>
         </w:tc>
@@ -640,7 +640,7 @@
                 <w:sz w:val="17"/>
                 <w:szCs w:val="17"/>
               </w:rPr>
-              <w:t xml:space="preserve">Neon Postgres (wallets + transactions)</w:t>
+              <w:t xml:space="preserve">Neon Postgres (wallets + labeled transactions)</w:t>
             </w:r>
           </w:p>
         </w:tc>
@@ -725,7 +725,7 @@
                 <w:sz w:val="17"/>
                 <w:szCs w:val="17"/>
               </w:rPr>
-              <w:t xml:space="preserve">All agent txs via BaseScan API sync</w:t>
+              <w:t xml:space="preserve">184 transactions via Blockscout sync</w:t>
             </w:r>
           </w:p>
         </w:tc>
@@ -932,7 +932,7 @@
                 <w:sz w:val="17"/>
                 <w:szCs w:val="17"/>
               </w:rPr>
-              <w:t xml:space="preserve">28 / 30</w:t>
+              <w:t xml:space="preserve">30 / 30</w:t>
             </w:r>
           </w:p>
         </w:tc>
@@ -961,7 +961,7 @@
                 <w:sz w:val="17"/>
                 <w:szCs w:val="17"/>
               </w:rPr>
-              <w:t xml:space="preserve">Failed (unfunded)</w:t>
+              <w:t xml:space="preserve">Cloud instances</w:t>
             </w:r>
           </w:p>
         </w:tc>
@@ -988,7 +988,7 @@
                 <w:sz w:val="17"/>
                 <w:szCs w:val="17"/>
               </w:rPr>
-              <w:t xml:space="preserve">2 (CDP faucet rate limit)</w:t>
+              <w:t xml:space="preserve">2 (Nuremberg + Helsinki)</w:t>
             </w:r>
           </w:p>
         </w:tc>

</xml_diff>